<commit_message>
modify word file of gases products
</commit_message>
<xml_diff>
--- a/assets/Products/Medical Gases/CBM - PIN-INDEX REGULATOR/CBMT Regulator O2 Cylinders.docx
+++ b/assets/Products/Medical Gases/CBM - PIN-INDEX REGULATOR/CBMT Regulator O2 Cylinders.docx
@@ -1,6 +1,6 @@
 
 <file path=word/document.xml><?xml version="1.0" encoding="utf-8"?>
-<w:document xmlns:wpc="http://schemas.microsoft.com/office/word/2010/wordprocessingCanvas" xmlns:cx="http://schemas.microsoft.com/office/drawing/2014/chartex" xmlns:cx1="http://schemas.microsoft.com/office/drawing/2015/9/8/chartex" xmlns:cx2="http://schemas.microsoft.com/office/drawing/2015/10/21/chartex" xmlns:cx3="http://schemas.microsoft.com/office/drawing/2016/5/9/chartex" xmlns:cx4="http://schemas.microsoft.com/office/drawing/2016/5/10/chartex" xmlns:cx5="http://schemas.microsoft.com/office/drawing/2016/5/11/chartex" xmlns:cx6="http://schemas.microsoft.com/office/drawing/2016/5/12/chartex" xmlns:cx7="http://schemas.microsoft.com/office/drawing/2016/5/13/chartex" xmlns:cx8="http://schemas.microsoft.com/office/drawing/2016/5/14/chartex" xmlns:mc="http://schemas.openxmlformats.org/markup-compatibility/2006" xmlns:aink="http://schemas.microsoft.com/office/drawing/2016/ink" xmlns:am3d="http://schemas.microsoft.com/office/drawing/2017/model3d" xmlns:o="urn:schemas-microsoft-com:office:office" xmlns:oel="http://schemas.microsoft.com/office/2019/extlst" xmlns:r="http://schemas.openxmlformats.org/officeDocument/2006/relationships" xmlns:m="http://schemas.openxmlformats.org/officeDocument/2006/math" xmlns:v="urn:schemas-microsoft-com:vml" xmlns:wp14="http://schemas.microsoft.com/office/word/2010/wordprocessingDrawing" xmlns:wp="http://schemas.openxmlformats.org/drawingml/2006/wordprocessingDrawing" xmlns:w10="urn:schemas-microsoft-com:office:word" xmlns:w="http://schemas.openxmlformats.org/wordprocessingml/2006/main" xmlns:w14="http://schemas.microsoft.com/office/word/2010/wordml" xmlns:w15="http://schemas.microsoft.com/office/word/2012/wordml" xmlns:w16cex="http://schemas.microsoft.com/office/word/2018/wordml/cex" xmlns:w16cid="http://schemas.microsoft.com/office/word/2016/wordml/cid" xmlns:w16="http://schemas.microsoft.com/office/word/2018/wordml" xmlns:w16du="http://schemas.microsoft.com/office/word/2023/wordml/word16du" xmlns:w16sdtdh="http://schemas.microsoft.com/office/word/2020/wordml/sdtdatahash" xmlns:w16sdtfl="http://schemas.microsoft.com/office/word/2024/wordml/sdtformatlock" xmlns:w16se="http://schemas.microsoft.com/office/word/2015/wordml/symex" xmlns:wpg="http://schemas.microsoft.com/office/word/2010/wordprocessingGroup" xmlns:wpi="http://schemas.microsoft.com/office/word/2010/wordprocessingInk" xmlns:wne="http://schemas.microsoft.com/office/word/2006/wordml" xmlns:wps="http://schemas.microsoft.com/office/word/2010/wordprocessingShape" mc:Ignorable="w14 w15 w16se w16cid w16 w16cex w16sdtdh w16sdtfl w16du wp14">
+<w:document xmlns:wpc="http://schemas.microsoft.com/office/word/2010/wordprocessingCanvas" xmlns:cx="http://schemas.microsoft.com/office/drawing/2014/chartex" xmlns:cx1="http://schemas.microsoft.com/office/drawing/2015/9/8/chartex" xmlns:cx2="http://schemas.microsoft.com/office/drawing/2015/10/21/chartex" xmlns:cx3="http://schemas.microsoft.com/office/drawing/2016/5/9/chartex" xmlns:cx4="http://schemas.microsoft.com/office/drawing/2016/5/10/chartex" xmlns:cx5="http://schemas.microsoft.com/office/drawing/2016/5/11/chartex" xmlns:cx6="http://schemas.microsoft.com/office/drawing/2016/5/12/chartex" xmlns:cx7="http://schemas.microsoft.com/office/drawing/2016/5/13/chartex" xmlns:cx8="http://schemas.microsoft.com/office/drawing/2016/5/14/chartex" xmlns:mc="http://schemas.openxmlformats.org/markup-compatibility/2006" xmlns:aink="http://schemas.microsoft.com/office/drawing/2016/ink" xmlns:am3d="http://schemas.microsoft.com/office/drawing/2017/model3d" xmlns:o="urn:schemas-microsoft-com:office:office" xmlns:r="http://schemas.openxmlformats.org/officeDocument/2006/relationships" xmlns:m="http://schemas.openxmlformats.org/officeDocument/2006/math" xmlns:v="urn:schemas-microsoft-com:vml" xmlns:wp14="http://schemas.microsoft.com/office/word/2010/wordprocessingDrawing" xmlns:wp="http://schemas.openxmlformats.org/drawingml/2006/wordprocessingDrawing" xmlns:w10="urn:schemas-microsoft-com:office:word" xmlns:w="http://schemas.openxmlformats.org/wordprocessingml/2006/main" xmlns:w14="http://schemas.microsoft.com/office/word/2010/wordml" xmlns:w15="http://schemas.microsoft.com/office/word/2012/wordml" xmlns:w16cid="http://schemas.microsoft.com/office/word/2016/wordml/cid" xmlns:w16se="http://schemas.microsoft.com/office/word/2015/wordml/symex" xmlns:wpg="http://schemas.microsoft.com/office/word/2010/wordprocessingGroup" xmlns:wpi="http://schemas.microsoft.com/office/word/2010/wordprocessingInk" xmlns:wne="http://schemas.microsoft.com/office/word/2006/wordml" xmlns:wps="http://schemas.microsoft.com/office/word/2010/wordprocessingShape" mc:Ignorable="w14 w15 w16se w16cid wp14">
   <w:body>
     <w:p>
       <w:pPr>
@@ -321,25 +321,6 @@
     <w:p>
       <w:pPr>
         <w:numPr>
-          <w:ilvl w:val="0"/>
-          <w:numId w:val="24"/>
-        </w:numPr>
-        <w:bidi w:val="0"/>
-        <w:jc w:val="left"/>
-        <w:rPr>
-          <w:bCs/>
-        </w:rPr>
-      </w:pPr>
-      <w:r>
-        <w:rPr>
-          <w:bCs/>
-        </w:rPr>
-        <w:t xml:space="preserve">Selectable flow settings: </w:t>
-      </w:r>
-    </w:p>
-    <w:p>
-      <w:pPr>
-        <w:numPr>
           <w:ilvl w:val="1"/>
           <w:numId w:val="24"/>
         </w:numPr>
@@ -354,8 +335,23 @@
           <w:bCs/>
         </w:rPr>
         <w:lastRenderedPageBreak/>
+        <w:t xml:space="preserve">Selectable flow settings: </w:t>
+      </w:r>
+      <w:r>
+        <w:rPr>
+          <w:bCs/>
+        </w:rPr>
         <w:t xml:space="preserve">0, 0.5, 1, 2, 3, 4, 5, 6, 8, 10, 15, 25 LPM </w:t>
       </w:r>
+    </w:p>
+    <w:p>
+      <w:pPr>
+        <w:bidi w:val="0"/>
+        <w:jc w:val="left"/>
+        <w:rPr>
+          <w:bCs/>
+        </w:rPr>
+      </w:pPr>
     </w:p>
     <w:p>
       <w:pPr>
@@ -396,22 +392,6 @@
     </w:p>
     <w:p>
       <w:pPr>
-        <w:bidi w:val="0"/>
-        <w:ind w:left="720"/>
-        <w:jc w:val="left"/>
-        <w:rPr>
-          <w:bCs/>
-        </w:rPr>
-      </w:pPr>
-      <w:r>
-        <w:rPr>
-          <w:bCs/>
-        </w:rPr>
-        <w:t>Available Models (Overview)</w:t>
-      </w:r>
-    </w:p>
-    <w:p>
-      <w:pPr>
         <w:numPr>
           <w:ilvl w:val="0"/>
           <w:numId w:val="25"/>
@@ -422,12 +402,29 @@
           <w:bCs/>
         </w:rPr>
       </w:pPr>
+      <w:bookmarkStart w:id="0" w:name="_GoBack"/>
+      <w:bookmarkEnd w:id="0"/>
       <w:r>
         <w:rPr>
           <w:bCs/>
         </w:rPr>
         <w:t xml:space="preserve">YR-MT870 Series: </w:t>
       </w:r>
+      <w:r>
+        <w:rPr>
+          <w:bCs/>
+        </w:rPr>
+        <w:t>85 mm / 115 mm / 120 mm / 125 mm / 165 mm</w:t>
+      </w:r>
+    </w:p>
+    <w:p>
+      <w:pPr>
+        <w:bidi w:val="0"/>
+        <w:jc w:val="left"/>
+        <w:rPr>
+          <w:bCs/>
+        </w:rPr>
+      </w:pPr>
     </w:p>
     <w:p>
       <w:pPr>
@@ -445,7 +442,7 @@
         <w:rPr>
           <w:bCs/>
         </w:rPr>
-        <w:t xml:space="preserve">85 mm / 115 mm / 120 mm / 125 mm / 165 mm </w:t>
+        <w:t xml:space="preserve">CGA870 pin index connection </w:t>
       </w:r>
     </w:p>
     <w:p>
@@ -464,25 +461,6 @@
         <w:rPr>
           <w:bCs/>
         </w:rPr>
-        <w:t xml:space="preserve">CGA870 pin index connection </w:t>
-      </w:r>
-    </w:p>
-    <w:p>
-      <w:pPr>
-        <w:numPr>
-          <w:ilvl w:val="1"/>
-          <w:numId w:val="25"/>
-        </w:numPr>
-        <w:bidi w:val="0"/>
-        <w:jc w:val="left"/>
-        <w:rPr>
-          <w:bCs/>
-        </w:rPr>
-      </w:pPr>
-      <w:r>
-        <w:rPr>
-          <w:bCs/>
-        </w:rPr>
         <w:t xml:space="preserve">Outlet: Barbed outlet Ø8 mm </w:t>
       </w:r>
     </w:p>
@@ -618,25 +596,6 @@
     <w:p>
       <w:pPr>
         <w:numPr>
-          <w:ilvl w:val="0"/>
-          <w:numId w:val="26"/>
-        </w:numPr>
-        <w:bidi w:val="0"/>
-        <w:jc w:val="left"/>
-        <w:rPr>
-          <w:bCs/>
-        </w:rPr>
-      </w:pPr>
-      <w:r>
-        <w:rPr>
-          <w:bCs/>
-        </w:rPr>
-        <w:t xml:space="preserve">Packaging: </w:t>
-      </w:r>
-    </w:p>
-    <w:p>
-      <w:pPr>
-        <w:numPr>
           <w:ilvl w:val="1"/>
           <w:numId w:val="26"/>
         </w:numPr>
@@ -650,192 +609,82 @@
         <w:rPr>
           <w:bCs/>
         </w:rPr>
-        <w:t xml:space="preserve">20 pcs / carton </w:t>
+        <w:t xml:space="preserve">Packaging: </w:t>
+      </w:r>
+      <w:r>
+        <w:rPr>
+          <w:bCs/>
+          <w:szCs w:val="36"/>
+        </w:rPr>
+        <w:t>20 pcs / carton</w:t>
+      </w:r>
+      <w:r>
+        <w:rPr>
+          <w:rFonts w:hint="cs"/>
+          <w:bCs/>
+          <w:szCs w:val="36"/>
+          <w:rtl/>
+        </w:rPr>
+        <w:t xml:space="preserve"> </w:t>
+      </w:r>
+      <w:proofErr w:type="gramStart"/>
+      <w:r>
+        <w:rPr>
+          <w:rFonts w:hint="cs"/>
+          <w:bCs/>
+          <w:szCs w:val="36"/>
+          <w:rtl/>
+        </w:rPr>
+        <w:t xml:space="preserve">&amp;  </w:t>
+      </w:r>
+      <w:r>
+        <w:rPr>
+          <w:bCs/>
+          <w:szCs w:val="36"/>
+        </w:rPr>
+        <w:t>Carton</w:t>
+      </w:r>
+      <w:proofErr w:type="gramEnd"/>
+      <w:r>
+        <w:rPr>
+          <w:bCs/>
+          <w:szCs w:val="36"/>
+        </w:rPr>
+        <w:t xml:space="preserve"> size: 40.5 × 15.5 × 35.5 cm</w:t>
+      </w:r>
+      <w:r>
+        <w:rPr>
+          <w:bCs/>
+          <w:szCs w:val="36"/>
+        </w:rPr>
+        <w:t xml:space="preserve"> &amp; </w:t>
+      </w:r>
+      <w:r>
+        <w:rPr>
+          <w:bCs/>
+          <w:szCs w:val="36"/>
+        </w:rPr>
+        <w:t>Gross weight: 9.8 kg</w:t>
+      </w:r>
+      <w:r>
+        <w:rPr>
+          <w:bCs/>
+        </w:rPr>
+        <w:t xml:space="preserve"> </w:t>
       </w:r>
     </w:p>
     <w:p>
       <w:pPr>
-        <w:numPr>
-          <w:ilvl w:val="1"/>
-          <w:numId w:val="26"/>
-        </w:numPr>
         <w:bidi w:val="0"/>
         <w:jc w:val="left"/>
         <w:rPr>
           <w:bCs/>
         </w:rPr>
       </w:pPr>
-      <w:r>
-        <w:rPr>
-          <w:bCs/>
-        </w:rPr>
-        <w:t xml:space="preserve">Carton size: 40.5 × 15.5 × 35.5 cm </w:t>
-      </w:r>
     </w:p>
     <w:p>
       <w:pPr>
-        <w:numPr>
-          <w:ilvl w:val="1"/>
-          <w:numId w:val="26"/>
-        </w:numPr>
         <w:bidi w:val="0"/>
-        <w:jc w:val="left"/>
-        <w:rPr>
-          <w:bCs/>
-        </w:rPr>
-      </w:pPr>
-      <w:r>
-        <w:rPr>
-          <w:bCs/>
-        </w:rPr>
-        <w:t xml:space="preserve">Gross weight: 9.8 kg </w:t>
-      </w:r>
-    </w:p>
-    <w:p>
-      <w:pPr>
-        <w:bidi w:val="0"/>
-        <w:jc w:val="left"/>
-        <w:rPr>
-          <w:bCs/>
-        </w:rPr>
-      </w:pPr>
-    </w:p>
-    <w:p>
-      <w:pPr>
-        <w:bidi w:val="0"/>
-        <w:jc w:val="left"/>
-        <w:rPr>
-          <w:bCs/>
-        </w:rPr>
-      </w:pPr>
-    </w:p>
-    <w:p>
-      <w:pPr>
-        <w:bidi w:val="0"/>
-        <w:ind w:left="720"/>
-        <w:jc w:val="left"/>
-        <w:rPr>
-          <w:bCs/>
-        </w:rPr>
-      </w:pPr>
-    </w:p>
-    <w:p>
-      <w:pPr>
-        <w:bidi w:val="0"/>
-        <w:ind w:left="720"/>
-        <w:jc w:val="left"/>
-        <w:rPr>
-          <w:bCs/>
-        </w:rPr>
-      </w:pPr>
-    </w:p>
-    <w:p>
-      <w:pPr>
-        <w:bidi w:val="0"/>
-        <w:ind w:left="720"/>
-        <w:jc w:val="left"/>
-        <w:rPr>
-          <w:bCs/>
-        </w:rPr>
-      </w:pPr>
-    </w:p>
-    <w:p>
-      <w:pPr>
-        <w:bidi w:val="0"/>
-        <w:ind w:left="720"/>
-        <w:jc w:val="left"/>
-        <w:rPr>
-          <w:bCs/>
-        </w:rPr>
-      </w:pPr>
-      <w:r>
-        <w:rPr>
-          <w:bCs/>
-        </w:rPr>
-        <w:t>Key Variants &amp; Options</w:t>
-      </w:r>
-    </w:p>
-    <w:p>
-      <w:pPr>
-        <w:numPr>
-          <w:ilvl w:val="0"/>
-          <w:numId w:val="27"/>
-        </w:numPr>
-        <w:bidi w:val="0"/>
-        <w:jc w:val="left"/>
-        <w:rPr>
-          <w:bCs/>
-        </w:rPr>
-      </w:pPr>
-      <w:r>
-        <w:rPr>
-          <w:bCs/>
-        </w:rPr>
-        <w:lastRenderedPageBreak/>
-        <w:t xml:space="preserve">Color-coded regulators for department identification </w:t>
-      </w:r>
-    </w:p>
-    <w:p>
-      <w:pPr>
-        <w:numPr>
-          <w:ilvl w:val="0"/>
-          <w:numId w:val="27"/>
-        </w:numPr>
-        <w:bidi w:val="0"/>
-        <w:jc w:val="left"/>
-        <w:rPr>
-          <w:bCs/>
-        </w:rPr>
-      </w:pPr>
-      <w:r>
-        <w:rPr>
-          <w:bCs/>
-        </w:rPr>
-        <w:t xml:space="preserve">Twin gauge models (YR-MT540-F series) </w:t>
-      </w:r>
-    </w:p>
-    <w:p>
-      <w:pPr>
-        <w:numPr>
-          <w:ilvl w:val="0"/>
-          <w:numId w:val="27"/>
-        </w:numPr>
-        <w:bidi w:val="0"/>
-        <w:jc w:val="left"/>
-        <w:rPr>
-          <w:bCs/>
-        </w:rPr>
-      </w:pPr>
-      <w:r>
-        <w:rPr>
-          <w:bCs/>
-        </w:rPr>
-        <w:t xml:space="preserve">Compact and angled models for different clinical setups </w:t>
-      </w:r>
-    </w:p>
-    <w:p>
-      <w:pPr>
-        <w:numPr>
-          <w:ilvl w:val="0"/>
-          <w:numId w:val="27"/>
-        </w:numPr>
-        <w:bidi w:val="0"/>
-        <w:jc w:val="left"/>
-        <w:rPr>
-          <w:bCs/>
-        </w:rPr>
-      </w:pPr>
-      <w:r>
-        <w:rPr>
-          <w:bCs/>
-        </w:rPr>
-        <w:t xml:space="preserve">Lightweight portable versions </w:t>
-      </w:r>
-    </w:p>
-    <w:p>
-      <w:pPr>
-        <w:bidi w:val="0"/>
-        <w:ind w:left="720"/>
         <w:jc w:val="left"/>
         <w:rPr>
           <w:bCs/>
@@ -853,7 +702,7 @@
 </file>
 
 <file path=word/numbering.xml><?xml version="1.0" encoding="utf-8"?>
-<w:numbering xmlns:wpc="http://schemas.microsoft.com/office/word/2010/wordprocessingCanvas" xmlns:cx="http://schemas.microsoft.com/office/drawing/2014/chartex" xmlns:cx1="http://schemas.microsoft.com/office/drawing/2015/9/8/chartex" xmlns:cx2="http://schemas.microsoft.com/office/drawing/2015/10/21/chartex" xmlns:cx3="http://schemas.microsoft.com/office/drawing/2016/5/9/chartex" xmlns:cx4="http://schemas.microsoft.com/office/drawing/2016/5/10/chartex" xmlns:cx5="http://schemas.microsoft.com/office/drawing/2016/5/11/chartex" xmlns:cx6="http://schemas.microsoft.com/office/drawing/2016/5/12/chartex" xmlns:cx7="http://schemas.microsoft.com/office/drawing/2016/5/13/chartex" xmlns:cx8="http://schemas.microsoft.com/office/drawing/2016/5/14/chartex" xmlns:mc="http://schemas.openxmlformats.org/markup-compatibility/2006" xmlns:aink="http://schemas.microsoft.com/office/drawing/2016/ink" xmlns:am3d="http://schemas.microsoft.com/office/drawing/2017/model3d" xmlns:o="urn:schemas-microsoft-com:office:office" xmlns:oel="http://schemas.microsoft.com/office/2019/extlst" xmlns:r="http://schemas.openxmlformats.org/officeDocument/2006/relationships" xmlns:m="http://schemas.openxmlformats.org/officeDocument/2006/math" xmlns:v="urn:schemas-microsoft-com:vml" xmlns:wp14="http://schemas.microsoft.com/office/word/2010/wordprocessingDrawing" xmlns:wp="http://schemas.openxmlformats.org/drawingml/2006/wordprocessingDrawing" xmlns:w10="urn:schemas-microsoft-com:office:word" xmlns:w="http://schemas.openxmlformats.org/wordprocessingml/2006/main" xmlns:w14="http://schemas.microsoft.com/office/word/2010/wordml" xmlns:w15="http://schemas.microsoft.com/office/word/2012/wordml" xmlns:w16cex="http://schemas.microsoft.com/office/word/2018/wordml/cex" xmlns:w16cid="http://schemas.microsoft.com/office/word/2016/wordml/cid" xmlns:w16="http://schemas.microsoft.com/office/word/2018/wordml" xmlns:w16du="http://schemas.microsoft.com/office/word/2023/wordml/word16du" xmlns:w16sdtdh="http://schemas.microsoft.com/office/word/2020/wordml/sdtdatahash" xmlns:w16sdtfl="http://schemas.microsoft.com/office/word/2024/wordml/sdtformatlock" xmlns:w16se="http://schemas.microsoft.com/office/word/2015/wordml/symex" xmlns:wpg="http://schemas.microsoft.com/office/word/2010/wordprocessingGroup" xmlns:wpi="http://schemas.microsoft.com/office/word/2010/wordprocessingInk" xmlns:wne="http://schemas.microsoft.com/office/word/2006/wordml" xmlns:wps="http://schemas.microsoft.com/office/word/2010/wordprocessingShape" mc:Ignorable="w14 w15 w16se w16cid w16 w16cex w16sdtdh w16sdtfl w16du wp14">
+<w:numbering xmlns:wpc="http://schemas.microsoft.com/office/word/2010/wordprocessingCanvas" xmlns:cx="http://schemas.microsoft.com/office/drawing/2014/chartex" xmlns:cx1="http://schemas.microsoft.com/office/drawing/2015/9/8/chartex" xmlns:cx2="http://schemas.microsoft.com/office/drawing/2015/10/21/chartex" xmlns:cx3="http://schemas.microsoft.com/office/drawing/2016/5/9/chartex" xmlns:cx4="http://schemas.microsoft.com/office/drawing/2016/5/10/chartex" xmlns:cx5="http://schemas.microsoft.com/office/drawing/2016/5/11/chartex" xmlns:cx6="http://schemas.microsoft.com/office/drawing/2016/5/12/chartex" xmlns:cx7="http://schemas.microsoft.com/office/drawing/2016/5/13/chartex" xmlns:cx8="http://schemas.microsoft.com/office/drawing/2016/5/14/chartex" xmlns:mc="http://schemas.openxmlformats.org/markup-compatibility/2006" xmlns:aink="http://schemas.microsoft.com/office/drawing/2016/ink" xmlns:am3d="http://schemas.microsoft.com/office/drawing/2017/model3d" xmlns:o="urn:schemas-microsoft-com:office:office" xmlns:r="http://schemas.openxmlformats.org/officeDocument/2006/relationships" xmlns:m="http://schemas.openxmlformats.org/officeDocument/2006/math" xmlns:v="urn:schemas-microsoft-com:vml" xmlns:wp14="http://schemas.microsoft.com/office/word/2010/wordprocessingDrawing" xmlns:wp="http://schemas.openxmlformats.org/drawingml/2006/wordprocessingDrawing" xmlns:w10="urn:schemas-microsoft-com:office:word" xmlns:w="http://schemas.openxmlformats.org/wordprocessingml/2006/main" xmlns:w14="http://schemas.microsoft.com/office/word/2010/wordml" xmlns:w15="http://schemas.microsoft.com/office/word/2012/wordml" xmlns:w16cid="http://schemas.microsoft.com/office/word/2016/wordml/cid" xmlns:w16se="http://schemas.microsoft.com/office/word/2015/wordml/symex" xmlns:wpg="http://schemas.microsoft.com/office/word/2010/wordprocessingGroup" xmlns:wpi="http://schemas.microsoft.com/office/word/2010/wordprocessingInk" xmlns:wne="http://schemas.microsoft.com/office/word/2006/wordml" xmlns:wps="http://schemas.microsoft.com/office/word/2010/wordprocessingShape" mc:Ignorable="w14 w15 w16se w16cid wp14">
   <w:abstractNum w:abstractNumId="0" w15:restartNumberingAfterBreak="0">
     <w:nsid w:val="066C0423"/>
     <w:multiLevelType w:val="multilevel"/>
@@ -4840,92 +4689,92 @@
       </w:rPr>
     </w:lvl>
   </w:abstractNum>
-  <w:num w:numId="1" w16cid:durableId="194781471">
+  <w:num w:numId="1">
     <w:abstractNumId w:val="16"/>
   </w:num>
-  <w:num w:numId="2" w16cid:durableId="818501226">
+  <w:num w:numId="2">
     <w:abstractNumId w:val="17"/>
   </w:num>
-  <w:num w:numId="3" w16cid:durableId="426510884">
+  <w:num w:numId="3">
     <w:abstractNumId w:val="21"/>
   </w:num>
-  <w:num w:numId="4" w16cid:durableId="855775313">
+  <w:num w:numId="4">
     <w:abstractNumId w:val="7"/>
   </w:num>
-  <w:num w:numId="5" w16cid:durableId="1464805809">
+  <w:num w:numId="5">
     <w:abstractNumId w:val="10"/>
   </w:num>
-  <w:num w:numId="6" w16cid:durableId="90778446">
+  <w:num w:numId="6">
     <w:abstractNumId w:val="11"/>
   </w:num>
-  <w:num w:numId="7" w16cid:durableId="1631666986">
+  <w:num w:numId="7">
     <w:abstractNumId w:val="26"/>
   </w:num>
-  <w:num w:numId="8" w16cid:durableId="343750556">
+  <w:num w:numId="8">
     <w:abstractNumId w:val="8"/>
   </w:num>
-  <w:num w:numId="9" w16cid:durableId="2094088539">
+  <w:num w:numId="9">
     <w:abstractNumId w:val="23"/>
   </w:num>
-  <w:num w:numId="10" w16cid:durableId="1566451545">
+  <w:num w:numId="10">
     <w:abstractNumId w:val="6"/>
   </w:num>
-  <w:num w:numId="11" w16cid:durableId="69353682">
+  <w:num w:numId="11">
     <w:abstractNumId w:val="2"/>
   </w:num>
-  <w:num w:numId="12" w16cid:durableId="1639873690">
+  <w:num w:numId="12">
     <w:abstractNumId w:val="1"/>
   </w:num>
-  <w:num w:numId="13" w16cid:durableId="826016149">
+  <w:num w:numId="13">
     <w:abstractNumId w:val="25"/>
   </w:num>
-  <w:num w:numId="14" w16cid:durableId="1201162176">
+  <w:num w:numId="14">
     <w:abstractNumId w:val="15"/>
   </w:num>
-  <w:num w:numId="15" w16cid:durableId="1898779675">
+  <w:num w:numId="15">
     <w:abstractNumId w:val="13"/>
   </w:num>
-  <w:num w:numId="16" w16cid:durableId="782652839">
+  <w:num w:numId="16">
     <w:abstractNumId w:val="18"/>
   </w:num>
-  <w:num w:numId="17" w16cid:durableId="33586175">
+  <w:num w:numId="17">
     <w:abstractNumId w:val="3"/>
   </w:num>
-  <w:num w:numId="18" w16cid:durableId="1255287908">
+  <w:num w:numId="18">
     <w:abstractNumId w:val="22"/>
   </w:num>
-  <w:num w:numId="19" w16cid:durableId="1625647509">
+  <w:num w:numId="19">
     <w:abstractNumId w:val="9"/>
   </w:num>
-  <w:num w:numId="20" w16cid:durableId="586571722">
+  <w:num w:numId="20">
     <w:abstractNumId w:val="12"/>
   </w:num>
-  <w:num w:numId="21" w16cid:durableId="269317434">
+  <w:num w:numId="21">
     <w:abstractNumId w:val="5"/>
   </w:num>
-  <w:num w:numId="22" w16cid:durableId="1366173079">
+  <w:num w:numId="22">
     <w:abstractNumId w:val="24"/>
   </w:num>
-  <w:num w:numId="23" w16cid:durableId="1821269640">
+  <w:num w:numId="23">
     <w:abstractNumId w:val="14"/>
   </w:num>
-  <w:num w:numId="24" w16cid:durableId="1403288646">
+  <w:num w:numId="24">
     <w:abstractNumId w:val="0"/>
   </w:num>
-  <w:num w:numId="25" w16cid:durableId="1987709229">
+  <w:num w:numId="25">
     <w:abstractNumId w:val="19"/>
   </w:num>
-  <w:num w:numId="26" w16cid:durableId="37896485">
+  <w:num w:numId="26">
     <w:abstractNumId w:val="4"/>
   </w:num>
-  <w:num w:numId="27" w16cid:durableId="709650773">
+  <w:num w:numId="27">
     <w:abstractNumId w:val="20"/>
   </w:num>
 </w:numbering>
 </file>
 
 <file path=word/styles.xml><?xml version="1.0" encoding="utf-8"?>
-<w:styles xmlns:mc="http://schemas.openxmlformats.org/markup-compatibility/2006" xmlns:r="http://schemas.openxmlformats.org/officeDocument/2006/relationships" xmlns:w="http://schemas.openxmlformats.org/wordprocessingml/2006/main" xmlns:w14="http://schemas.microsoft.com/office/word/2010/wordml" xmlns:w15="http://schemas.microsoft.com/office/word/2012/wordml" xmlns:w16cex="http://schemas.microsoft.com/office/word/2018/wordml/cex" xmlns:w16cid="http://schemas.microsoft.com/office/word/2016/wordml/cid" xmlns:w16="http://schemas.microsoft.com/office/word/2018/wordml" xmlns:w16du="http://schemas.microsoft.com/office/word/2023/wordml/word16du" xmlns:w16sdtdh="http://schemas.microsoft.com/office/word/2020/wordml/sdtdatahash" xmlns:w16sdtfl="http://schemas.microsoft.com/office/word/2024/wordml/sdtformatlock" xmlns:w16se="http://schemas.microsoft.com/office/word/2015/wordml/symex" mc:Ignorable="w14 w15 w16se w16cid w16 w16cex w16sdtdh w16sdtfl w16du">
+<w:styles xmlns:mc="http://schemas.openxmlformats.org/markup-compatibility/2006" xmlns:r="http://schemas.openxmlformats.org/officeDocument/2006/relationships" xmlns:w="http://schemas.openxmlformats.org/wordprocessingml/2006/main" xmlns:w14="http://schemas.microsoft.com/office/word/2010/wordml" xmlns:w15="http://schemas.microsoft.com/office/word/2012/wordml" xmlns:w16cid="http://schemas.microsoft.com/office/word/2016/wordml/cid" xmlns:w16se="http://schemas.microsoft.com/office/word/2015/wordml/symex" mc:Ignorable="w14 w15 w16se w16cid">
   <w:docDefaults>
     <w:rPrDefault>
       <w:rPr>
@@ -4945,7 +4794,7 @@
       </w:pPr>
     </w:pPrDefault>
   </w:docDefaults>
-  <w:latentStyles w:defLockedState="0" w:defUIPriority="99" w:defSemiHidden="0" w:defUnhideWhenUsed="0" w:defQFormat="0" w:count="376">
+  <w:latentStyles w:defLockedState="0" w:defUIPriority="99" w:defSemiHidden="0" w:defUnhideWhenUsed="0" w:defQFormat="0" w:count="375">
     <w:lsdException w:name="Normal" w:uiPriority="0" w:qFormat="1"/>
     <w:lsdException w:name="heading 1" w:uiPriority="9" w:qFormat="1"/>
     <w:lsdException w:name="heading 2" w:semiHidden="1" w:uiPriority="9" w:unhideWhenUsed="1" w:qFormat="1"/>
@@ -5321,7 +5170,6 @@
     <w:lsdException w:name="Smart Hyperlink" w:semiHidden="1" w:unhideWhenUsed="1"/>
     <w:lsdException w:name="Hashtag" w:semiHidden="1" w:unhideWhenUsed="1"/>
     <w:lsdException w:name="Unresolved Mention" w:semiHidden="1" w:unhideWhenUsed="1"/>
-    <w:lsdException w:name="Smart Link" w:semiHidden="1" w:unhideWhenUsed="1"/>
   </w:latentStyles>
   <w:style w:type="paragraph" w:default="1" w:styleId="Normal">
     <w:name w:val="Normal"/>

</xml_diff>